<commit_message>
Shared lawmaking guide v2.0: alphabetized glossary-style entries, one page
Co-authored-by: CaptainWrechols <CaptainWrechols@users.noreply.github.com>
</commit_message>
<xml_diff>
--- a/briefs/nevada/how-nevada-lawmaking-works.docx
+++ b/briefs/nevada/how-nevada-lawmaking-works.docx
@@ -54,8 +54,18 @@
           <w:color w:val="444444"/>
           <w:sz w:val="20"/>
         </w:rPr>
-        <w:t>A plain-language guide to the lawmaking terms used in The Forum's four Nevada citizen briefs.</w:t>
+        <w:t>A plain-language guide to the lawmaking terms used in The Forum's four Nevada citizen briefs. The same guide appears in each brief's glossary.</w:t>
       </w:r>
+    </w:p>
+    <w:p>
+      <w:pPr>
+        <w:sectPr>
+          <w:pgSz w:w="12240" w:h="15840"/>
+          <w:pgMar w:top="864" w:right="864" w:bottom="864" w:left="864" w:header="720" w:footer="720" w:gutter="0"/>
+          <w:cols w:space="720"/>
+          <w:docGrid w:linePitch="360"/>
+        </w:sectPr>
+      </w:pPr>
     </w:p>
     <w:p>
       <w:pPr>
@@ -70,32 +80,24 @@
           <w:sz w:val="25"/>
           <w:spacing w:val="20"/>
         </w:rPr>
-        <w:t>THE PATH A BILL TRAVELS</w:t>
+        <w:t>LEGISLATIVE PROCESS GUIDE</w:t>
       </w:r>
     </w:p>
     <w:p>
       <w:pPr>
         <w:widowControl/>
-        <w:spacing w:before="0" w:after="40" w:lineRule="auto" w:line="247"/>
+        <w:spacing w:before="0" w:after="60" w:lineRule="auto" w:line="252"/>
+        <w:ind w:left="200"/>
       </w:pPr>
       <w:r>
         <w:rPr>
           <w:rFonts w:ascii="Arial" w:hAnsi="Arial" w:cs="Arial" w:eastAsia="Arial"/>
           <w:b w:val="0"/>
-          <w:i/>
-          <w:color w:val="666666"/>
+          <w:color w:val="C0392B"/>
           <w:sz w:val="20"/>
         </w:rPr>
-        <w:t>The steps every idea passes through — and the places it can stop.</w:t>
+        <w:t xml:space="preserve">▪  </w:t>
       </w:r>
-    </w:p>
-    <w:p>
-      <w:pPr>
-        <w:keepLines/>
-        <w:widowControl/>
-        <w:spacing w:before="0" w:after="56" w:lineRule="auto" w:line="247"/>
-        <w:jc w:val="both"/>
-      </w:pPr>
       <w:r>
         <w:rPr>
           <w:rFonts w:ascii="Arial" w:hAnsi="Arial" w:cs="Arial" w:eastAsia="Arial"/>
@@ -103,7 +105,7 @@
           <w:color w:val="1A2D4F"/>
           <w:sz w:val="20"/>
         </w:rPr>
-        <w:t>Session.</w:t>
+        <w:t>AB / SB:</w:t>
       </w:r>
       <w:r>
         <w:rPr>
@@ -112,16 +114,24 @@
           <w:color w:val="444444"/>
           <w:sz w:val="20"/>
         </w:rPr>
-        <w:t xml:space="preserve"> The Nevada Legislature meets for 120 days in odd-numbered years (2019, 2021, 2023, 2025). Any bill that has not finished every step when the session ends is dead and must start over in a future session.</w:t>
+        <w:t xml:space="preserve"> Assembly Bill / Senate Bill — the chamber a bill started in, plus its number. Numbering restarts every session, so the same number in different years is a different bill.</w:t>
       </w:r>
     </w:p>
     <w:p>
       <w:pPr>
-        <w:keepLines/>
         <w:widowControl/>
-        <w:spacing w:before="0" w:after="56" w:lineRule="auto" w:line="247"/>
-        <w:jc w:val="both"/>
+        <w:spacing w:before="0" w:after="60" w:lineRule="auto" w:line="252"/>
+        <w:ind w:left="200"/>
       </w:pPr>
+      <w:r>
+        <w:rPr>
+          <w:rFonts w:ascii="Arial" w:hAnsi="Arial" w:cs="Arial" w:eastAsia="Arial"/>
+          <w:b w:val="0"/>
+          <w:color w:val="C0392B"/>
+          <w:sz w:val="20"/>
+        </w:rPr>
+        <w:t xml:space="preserve">▪  </w:t>
+      </w:r>
       <w:r>
         <w:rPr>
           <w:rFonts w:ascii="Arial" w:hAnsi="Arial" w:cs="Arial" w:eastAsia="Arial"/>
@@ -129,7 +139,7 @@
           <w:color w:val="1A2D4F"/>
           <w:sz w:val="20"/>
         </w:rPr>
-        <w:t>Special session.</w:t>
+        <w:t>Amendment / concurrence:</w:t>
       </w:r>
       <w:r>
         <w:rPr>
@@ -138,16 +148,24 @@
           <w:color w:val="444444"/>
           <w:sz w:val="20"/>
         </w:rPr>
-        <w:t xml:space="preserve"> A short extra meeting the governor calls for specific topics — like the November 2025 session, where bills that ran out of regular-session time can pass.</w:t>
+        <w:t xml:space="preserve"> A change made to a bill along the way; if one chamber amends, the other must vote to accept — "concur in" — the change. Bills can die awaiting that one last vote.</w:t>
       </w:r>
     </w:p>
     <w:p>
       <w:pPr>
-        <w:keepLines/>
         <w:widowControl/>
-        <w:spacing w:before="0" w:after="56" w:lineRule="auto" w:line="247"/>
-        <w:jc w:val="both"/>
+        <w:spacing w:before="0" w:after="60" w:lineRule="auto" w:line="252"/>
+        <w:ind w:left="200"/>
       </w:pPr>
+      <w:r>
+        <w:rPr>
+          <w:rFonts w:ascii="Arial" w:hAnsi="Arial" w:cs="Arial" w:eastAsia="Arial"/>
+          <w:b w:val="0"/>
+          <w:color w:val="C0392B"/>
+          <w:sz w:val="20"/>
+        </w:rPr>
+        <w:t xml:space="preserve">▪  </w:t>
+      </w:r>
       <w:r>
         <w:rPr>
           <w:rFonts w:ascii="Arial" w:hAnsi="Arial" w:cs="Arial" w:eastAsia="Arial"/>
@@ -155,7 +173,41 @@
           <w:color w:val="1A2D4F"/>
           <w:sz w:val="20"/>
         </w:rPr>
-        <w:t>Chambers.</w:t>
+        <w:t>Appropriation:</w:t>
+      </w:r>
+      <w:r>
+        <w:rPr>
+          <w:rFonts w:ascii="Arial" w:hAnsi="Arial" w:cs="Arial" w:eastAsia="Arial"/>
+          <w:b w:val="0"/>
+          <w:color w:val="444444"/>
+          <w:sz w:val="20"/>
+        </w:rPr>
+        <w:t xml:space="preserve"> A bill or provision that sets aside state money for a purpose.</w:t>
+      </w:r>
+    </w:p>
+    <w:p>
+      <w:pPr>
+        <w:widowControl/>
+        <w:spacing w:before="0" w:after="60" w:lineRule="auto" w:line="252"/>
+        <w:ind w:left="200"/>
+      </w:pPr>
+      <w:r>
+        <w:rPr>
+          <w:rFonts w:ascii="Arial" w:hAnsi="Arial" w:cs="Arial" w:eastAsia="Arial"/>
+          <w:b w:val="0"/>
+          <w:color w:val="C0392B"/>
+          <w:sz w:val="20"/>
+        </w:rPr>
+        <w:t xml:space="preserve">▪  </w:t>
+      </w:r>
+      <w:r>
+        <w:rPr>
+          <w:rFonts w:ascii="Arial" w:hAnsi="Arial" w:cs="Arial" w:eastAsia="Arial"/>
+          <w:b/>
+          <w:color w:val="1A2D4F"/>
+          <w:sz w:val="20"/>
+        </w:rPr>
+        <w:t>Chambers:</w:t>
       </w:r>
       <w:r>
         <w:rPr>
@@ -169,11 +221,19 @@
     </w:p>
     <w:p>
       <w:pPr>
-        <w:keepLines/>
         <w:widowControl/>
-        <w:spacing w:before="0" w:after="56" w:lineRule="auto" w:line="247"/>
-        <w:jc w:val="both"/>
+        <w:spacing w:before="0" w:after="60" w:lineRule="auto" w:line="252"/>
+        <w:ind w:left="200"/>
       </w:pPr>
+      <w:r>
+        <w:rPr>
+          <w:rFonts w:ascii="Arial" w:hAnsi="Arial" w:cs="Arial" w:eastAsia="Arial"/>
+          <w:b w:val="0"/>
+          <w:color w:val="C0392B"/>
+          <w:sz w:val="20"/>
+        </w:rPr>
+        <w:t xml:space="preserve">▪  </w:t>
+      </w:r>
       <w:r>
         <w:rPr>
           <w:rFonts w:ascii="Arial" w:hAnsi="Arial" w:cs="Arial" w:eastAsia="Arial"/>
@@ -181,7 +241,7 @@
           <w:color w:val="1A2D4F"/>
           <w:sz w:val="20"/>
         </w:rPr>
-        <w:t>Committee / first committee.</w:t>
+        <w:t>Committee / first committee:</w:t>
       </w:r>
       <w:r>
         <w:rPr>
@@ -190,16 +250,24 @@
           <w:color w:val="444444"/>
           <w:sz w:val="20"/>
         </w:rPr>
-        <w:t xml:space="preserve"> A small panel of lawmakers that studies a bill and votes on whether to send it onward. Every bill starts in a committee, and most bills that fail die in their first one — "never heard" means it never even got a hearing.</w:t>
+        <w:t xml:space="preserve"> A small panel of lawmakers that studies a bill and votes on whether to send it onward; most bills that fail die in their first committee — "never heard" means no hearing at all.</w:t>
       </w:r>
     </w:p>
     <w:p>
       <w:pPr>
-        <w:keepLines/>
         <w:widowControl/>
-        <w:spacing w:before="0" w:after="56" w:lineRule="auto" w:line="247"/>
-        <w:jc w:val="both"/>
+        <w:spacing w:before="0" w:after="60" w:lineRule="auto" w:line="252"/>
+        <w:ind w:left="200"/>
       </w:pPr>
+      <w:r>
+        <w:rPr>
+          <w:rFonts w:ascii="Arial" w:hAnsi="Arial" w:cs="Arial" w:eastAsia="Arial"/>
+          <w:b w:val="0"/>
+          <w:color w:val="C0392B"/>
+          <w:sz w:val="20"/>
+        </w:rPr>
+        <w:t xml:space="preserve">▪  </w:t>
+      </w:r>
       <w:r>
         <w:rPr>
           <w:rFonts w:ascii="Arial" w:hAnsi="Arial" w:cs="Arial" w:eastAsia="Arial"/>
@@ -207,7 +275,7 @@
           <w:color w:val="1A2D4F"/>
           <w:sz w:val="20"/>
         </w:rPr>
-        <w:t>Floor vote / floor calendar.</w:t>
+        <w:t>D / R:</w:t>
       </w:r>
       <w:r>
         <w:rPr>
@@ -216,16 +284,24 @@
           <w:color w:val="444444"/>
           <w:sz w:val="20"/>
         </w:rPr>
-        <w:t xml:space="preserve"> A vote of the full chamber, and the schedule of bills waiting for one. A bill "dies on the calendar" when the session ends before its turn — a scheduling death, not a defeat on the merits.</w:t>
+        <w:t xml:space="preserve"> Democrat / Republican, shown after a legislator's name; "still serves" and "has left" reflect the current roster.</w:t>
       </w:r>
     </w:p>
     <w:p>
       <w:pPr>
-        <w:keepLines/>
         <w:widowControl/>
-        <w:spacing w:before="0" w:after="56" w:lineRule="auto" w:line="247"/>
-        <w:jc w:val="both"/>
+        <w:spacing w:before="0" w:after="60" w:lineRule="auto" w:line="252"/>
+        <w:ind w:left="200"/>
       </w:pPr>
+      <w:r>
+        <w:rPr>
+          <w:rFonts w:ascii="Arial" w:hAnsi="Arial" w:cs="Arial" w:eastAsia="Arial"/>
+          <w:b w:val="0"/>
+          <w:color w:val="C0392B"/>
+          <w:sz w:val="20"/>
+        </w:rPr>
+        <w:t xml:space="preserve">▪  </w:t>
+      </w:r>
       <w:r>
         <w:rPr>
           <w:rFonts w:ascii="Arial" w:hAnsi="Arial" w:cs="Arial" w:eastAsia="Arial"/>
@@ -233,7 +309,7 @@
           <w:color w:val="1A2D4F"/>
           <w:sz w:val="20"/>
         </w:rPr>
-        <w:t>Second house.</w:t>
+        <w:t>Delivered / signed / chapter:</w:t>
       </w:r>
       <w:r>
         <w:rPr>
@@ -242,16 +318,24 @@
           <w:color w:val="444444"/>
           <w:sz w:val="20"/>
         </w:rPr>
-        <w:t xml:space="preserve"> After passing the chamber where it started, a bill repeats the entire process — committee, then floor — in the other chamber.</w:t>
+        <w:t xml:space="preserve"> A passed bill is delivered to the governor; a signed bill becomes a numbered "chapter" of state law, and "no signature, no chapter" means it never became law.</w:t>
       </w:r>
     </w:p>
     <w:p>
       <w:pPr>
-        <w:keepLines/>
         <w:widowControl/>
-        <w:spacing w:before="0" w:after="56" w:lineRule="auto" w:line="247"/>
-        <w:jc w:val="both"/>
+        <w:spacing w:before="0" w:after="60" w:lineRule="auto" w:line="252"/>
+        <w:ind w:left="200"/>
       </w:pPr>
+      <w:r>
+        <w:rPr>
+          <w:rFonts w:ascii="Arial" w:hAnsi="Arial" w:cs="Arial" w:eastAsia="Arial"/>
+          <w:b w:val="0"/>
+          <w:color w:val="C0392B"/>
+          <w:sz w:val="20"/>
+        </w:rPr>
+        <w:t xml:space="preserve">▪  </w:t>
+      </w:r>
       <w:r>
         <w:rPr>
           <w:rFonts w:ascii="Arial" w:hAnsi="Arial" w:cs="Arial" w:eastAsia="Arial"/>
@@ -259,85 +343,7 @@
           <w:color w:val="1A2D4F"/>
           <w:sz w:val="20"/>
         </w:rPr>
-        <w:t>Amendment / concurrence.</w:t>
-      </w:r>
-      <w:r>
-        <w:rPr>
-          <w:rFonts w:ascii="Arial" w:hAnsi="Arial" w:cs="Arial" w:eastAsia="Arial"/>
-          <w:b w:val="0"/>
-          <w:color w:val="444444"/>
-          <w:sz w:val="20"/>
-        </w:rPr>
-        <w:t xml:space="preserve"> A change made to a bill along the way; if one chamber amends, the other must vote to accept — "concur in" — the change. Bills can die awaiting that one last vote.</w:t>
-      </w:r>
-    </w:p>
-    <w:p>
-      <w:pPr>
-        <w:keepLines/>
-        <w:widowControl/>
-        <w:spacing w:before="0" w:after="56" w:lineRule="auto" w:line="247"/>
-        <w:jc w:val="both"/>
-      </w:pPr>
-      <w:r>
-        <w:rPr>
-          <w:rFonts w:ascii="Arial" w:hAnsi="Arial" w:cs="Arial" w:eastAsia="Arial"/>
-          <w:b/>
-          <w:color w:val="1A2D4F"/>
-          <w:sz w:val="20"/>
-        </w:rPr>
-        <w:t>Delivered / signed / chapter.</w:t>
-      </w:r>
-      <w:r>
-        <w:rPr>
-          <w:rFonts w:ascii="Arial" w:hAnsi="Arial" w:cs="Arial" w:eastAsia="Arial"/>
-          <w:b w:val="0"/>
-          <w:color w:val="444444"/>
-          <w:sz w:val="20"/>
-        </w:rPr>
-        <w:t xml:space="preserve"> A bill that passes both chambers is delivered to the governor. A signed bill becomes a numbered "chapter" of state law; "no signature, no chapter" means the record ends without it becoming law.</w:t>
-      </w:r>
-    </w:p>
-    <w:p>
-      <w:pPr>
-        <w:keepLines/>
-        <w:widowControl/>
-        <w:spacing w:before="0" w:after="56" w:lineRule="auto" w:line="247"/>
-        <w:jc w:val="both"/>
-      </w:pPr>
-      <w:r>
-        <w:rPr>
-          <w:rFonts w:ascii="Arial" w:hAnsi="Arial" w:cs="Arial" w:eastAsia="Arial"/>
-          <w:b/>
-          <w:color w:val="1A2D4F"/>
-          <w:sz w:val="20"/>
-        </w:rPr>
-        <w:t>Veto.</w:t>
-      </w:r>
-      <w:r>
-        <w:rPr>
-          <w:rFonts w:ascii="Arial" w:hAnsi="Arial" w:cs="Arial" w:eastAsia="Arial"/>
-          <w:b w:val="0"/>
-          <w:color w:val="444444"/>
-          <w:sz w:val="20"/>
-        </w:rPr>
-        <w:t xml:space="preserve"> The governor's rejection of a bill that passed both chambers. A vetoed bill does not become law unless two-thirds of each chamber votes to override the veto.</w:t>
-      </w:r>
-    </w:p>
-    <w:p>
-      <w:pPr>
-        <w:keepLines/>
-        <w:widowControl/>
-        <w:spacing w:before="0" w:after="56" w:lineRule="auto" w:line="247"/>
-        <w:jc w:val="both"/>
-      </w:pPr>
-      <w:r>
-        <w:rPr>
-          <w:rFonts w:ascii="Arial" w:hAnsi="Arial" w:cs="Arial" w:eastAsia="Arial"/>
-          <w:b/>
-          <w:color w:val="1A2D4F"/>
-          <w:sz w:val="20"/>
-        </w:rPr>
-        <w:t>Died at session's end / out of time.</w:t>
+        <w:t>Died at session's end / out of time:</w:t>
       </w:r>
       <w:r>
         <w:rPr>
@@ -352,42 +358,18 @@
     <w:p>
       <w:pPr>
         <w:widowControl/>
-        <w:spacing w:before="100" w:after="40" w:lineRule="auto" w:line="254"/>
-      </w:pPr>
-      <w:r>
-        <w:rPr>
-          <w:rFonts w:ascii="Arial" w:hAnsi="Arial" w:cs="Arial" w:eastAsia="Arial"/>
-          <w:b/>
-          <w:color w:val="C0392B"/>
-          <w:sz w:val="25"/>
-          <w:spacing w:val="20"/>
-        </w:rPr>
-        <w:t>VOTES, MONEY, AND MAJORITIES</w:t>
-      </w:r>
-    </w:p>
-    <w:p>
-      <w:pPr>
-        <w:widowControl/>
-        <w:spacing w:before="0" w:after="40" w:lineRule="auto" w:line="247"/>
+        <w:spacing w:before="0" w:after="60" w:lineRule="auto" w:line="252"/>
+        <w:ind w:left="200"/>
       </w:pPr>
       <w:r>
         <w:rPr>
           <w:rFonts w:ascii="Arial" w:hAnsi="Arial" w:cs="Arial" w:eastAsia="Arial"/>
           <w:b w:val="0"/>
-          <w:i/>
-          <w:color w:val="666666"/>
+          <w:color w:val="C0392B"/>
           <w:sz w:val="20"/>
         </w:rPr>
-        <w:t>How to read the numbers that appear beside every bill.</w:t>
+        <w:t xml:space="preserve">▪  </w:t>
       </w:r>
-    </w:p>
-    <w:p>
-      <w:pPr>
-        <w:keepLines/>
-        <w:widowControl/>
-        <w:spacing w:before="0" w:after="56" w:lineRule="auto" w:line="247"/>
-        <w:jc w:val="both"/>
-      </w:pPr>
       <w:r>
         <w:rPr>
           <w:rFonts w:ascii="Arial" w:hAnsi="Arial" w:cs="Arial" w:eastAsia="Arial"/>
@@ -395,7 +377,7 @@
           <w:color w:val="1A2D4F"/>
           <w:sz w:val="20"/>
         </w:rPr>
-        <w:t>Vote pairs such as "42–0 and 21–0."</w:t>
+        <w:t>Floor vote / floor calendar:</w:t>
       </w:r>
       <w:r>
         <w:rPr>
@@ -404,16 +386,24 @@
           <w:color w:val="444444"/>
           <w:sz w:val="20"/>
         </w:rPr>
-        <w:t xml:space="preserve"> Floor votes are listed as yes–no tallies, one per chamber. 42–0 is a unanimous Assembly vote; 21–0 is a unanimous Senate vote.</w:t>
+        <w:t xml:space="preserve"> A vote of the full chamber, and the schedule of bills waiting for one; a bill "dies on the calendar" when the session ends before its turn — a scheduling death, not a defeat.</w:t>
       </w:r>
     </w:p>
     <w:p>
       <w:pPr>
-        <w:keepLines/>
         <w:widowControl/>
-        <w:spacing w:before="0" w:after="56" w:lineRule="auto" w:line="247"/>
-        <w:jc w:val="both"/>
+        <w:spacing w:before="0" w:after="60" w:lineRule="auto" w:line="252"/>
+        <w:ind w:left="200"/>
       </w:pPr>
+      <w:r>
+        <w:rPr>
+          <w:rFonts w:ascii="Arial" w:hAnsi="Arial" w:cs="Arial" w:eastAsia="Arial"/>
+          <w:b w:val="0"/>
+          <w:color w:val="C0392B"/>
+          <w:sz w:val="20"/>
+        </w:rPr>
+        <w:t xml:space="preserve">▪  </w:t>
+      </w:r>
       <w:r>
         <w:rPr>
           <w:rFonts w:ascii="Arial" w:hAnsi="Arial" w:cs="Arial" w:eastAsia="Arial"/>
@@ -421,7 +411,7 @@
           <w:color w:val="1A2D4F"/>
           <w:sz w:val="20"/>
         </w:rPr>
-        <w:t>Two-thirds majority.</w:t>
+        <w:t>Interim committee / interim study:</w:t>
       </w:r>
       <w:r>
         <w:rPr>
@@ -430,16 +420,24 @@
           <w:color w:val="444444"/>
           <w:sz w:val="20"/>
         </w:rPr>
-        <w:t xml:space="preserve"> Nevada's constitution requires a two-thirds vote in each chamber — 28 of 42 in the Assembly, 14 of 21 in the Senate — for any measure that raises revenue, including fees; a bill can win a majority and still fail this bar.</w:t>
+        <w:t xml:space="preserve"> Panels that meet between sessions to study a topic and prepare recommendations for the next session.</w:t>
       </w:r>
     </w:p>
     <w:p>
       <w:pPr>
-        <w:keepLines/>
         <w:widowControl/>
-        <w:spacing w:before="0" w:after="56" w:lineRule="auto" w:line="247"/>
-        <w:jc w:val="both"/>
+        <w:spacing w:before="0" w:after="60" w:lineRule="auto" w:line="252"/>
+        <w:ind w:left="200"/>
       </w:pPr>
+      <w:r>
+        <w:rPr>
+          <w:rFonts w:ascii="Arial" w:hAnsi="Arial" w:cs="Arial" w:eastAsia="Arial"/>
+          <w:b w:val="0"/>
+          <w:color w:val="C0392B"/>
+          <w:sz w:val="20"/>
+        </w:rPr>
+        <w:t xml:space="preserve">▪  </w:t>
+      </w:r>
       <w:r>
         <w:rPr>
           <w:rFonts w:ascii="Arial" w:hAnsi="Arial" w:cs="Arial" w:eastAsia="Arial"/>
@@ -447,7 +445,7 @@
           <w:color w:val="1A2D4F"/>
           <w:sz w:val="20"/>
         </w:rPr>
-        <w:t>Money committees / the money stage.</w:t>
+        <w:t>Money committees / the money stage:</w:t>
       </w:r>
       <w:r>
         <w:rPr>
@@ -461,11 +459,19 @@
     </w:p>
     <w:p>
       <w:pPr>
-        <w:keepLines/>
         <w:widowControl/>
-        <w:spacing w:before="0" w:after="56" w:lineRule="auto" w:line="247"/>
-        <w:jc w:val="both"/>
+        <w:spacing w:before="0" w:after="60" w:lineRule="auto" w:line="252"/>
+        <w:ind w:left="200"/>
       </w:pPr>
+      <w:r>
+        <w:rPr>
+          <w:rFonts w:ascii="Arial" w:hAnsi="Arial" w:cs="Arial" w:eastAsia="Arial"/>
+          <w:b w:val="0"/>
+          <w:color w:val="C0392B"/>
+          <w:sz w:val="20"/>
+        </w:rPr>
+        <w:t xml:space="preserve">▪  </w:t>
+      </w:r>
       <w:r>
         <w:rPr>
           <w:rFonts w:ascii="Arial" w:hAnsi="Arial" w:cs="Arial" w:eastAsia="Arial"/>
@@ -473,7 +479,7 @@
           <w:color w:val="1A2D4F"/>
           <w:sz w:val="20"/>
         </w:rPr>
-        <w:t>Appropriation.</w:t>
+        <w:t>Second house:</w:t>
       </w:r>
       <w:r>
         <w:rPr>
@@ -482,48 +488,24 @@
           <w:color w:val="444444"/>
           <w:sz w:val="20"/>
         </w:rPr>
-        <w:t xml:space="preserve"> A bill or provision that sets aside state money for a purpose.</w:t>
+        <w:t xml:space="preserve"> After passing the chamber where it started, a bill repeats the entire process — committee, then floor — in the other chamber.</w:t>
       </w:r>
     </w:p>
     <w:p>
       <w:pPr>
         <w:widowControl/>
-        <w:spacing w:before="100" w:after="40" w:lineRule="auto" w:line="254"/>
-      </w:pPr>
-      <w:r>
-        <w:rPr>
-          <w:rFonts w:ascii="Arial" w:hAnsi="Arial" w:cs="Arial" w:eastAsia="Arial"/>
-          <w:b/>
-          <w:color w:val="C0392B"/>
-          <w:sz w:val="25"/>
-          <w:spacing w:val="20"/>
-        </w:rPr>
-        <w:t>PEOPLE, LABELS, AND SHORTHAND</w:t>
-      </w:r>
-    </w:p>
-    <w:p>
-      <w:pPr>
-        <w:widowControl/>
-        <w:spacing w:before="0" w:after="40" w:lineRule="auto" w:line="247"/>
+        <w:spacing w:before="0" w:after="60" w:lineRule="auto" w:line="252"/>
+        <w:ind w:left="200"/>
       </w:pPr>
       <w:r>
         <w:rPr>
           <w:rFonts w:ascii="Arial" w:hAnsi="Arial" w:cs="Arial" w:eastAsia="Arial"/>
           <w:b w:val="0"/>
-          <w:i/>
-          <w:color w:val="666666"/>
+          <w:color w:val="C0392B"/>
           <w:sz w:val="20"/>
         </w:rPr>
-        <w:t>Who moves bills, and what the abbreviations mean.</w:t>
+        <w:t xml:space="preserve">▪  </w:t>
       </w:r>
-    </w:p>
-    <w:p>
-      <w:pPr>
-        <w:keepLines/>
-        <w:widowControl/>
-        <w:spacing w:before="0" w:after="56" w:lineRule="auto" w:line="247"/>
-        <w:jc w:val="both"/>
-      </w:pPr>
       <w:r>
         <w:rPr>
           <w:rFonts w:ascii="Arial" w:hAnsi="Arial" w:cs="Arial" w:eastAsia="Arial"/>
@@ -531,7 +513,7 @@
           <w:color w:val="1A2D4F"/>
           <w:sz w:val="20"/>
         </w:rPr>
-        <w:t>Sponsor.</w:t>
+        <w:t>Session:</w:t>
       </w:r>
       <w:r>
         <w:rPr>
@@ -540,16 +522,24 @@
           <w:color w:val="444444"/>
           <w:sz w:val="20"/>
         </w:rPr>
-        <w:t xml:space="preserve"> The lawmaker or committee that formally introduces a bill. A committee-sponsored bill has no single author. Cross-party sponsorship — named sponsors from both parties — is one of the strongest signals a bill will pass.</w:t>
+        <w:t xml:space="preserve"> The Legislature meets for 120 days in odd-numbered years (2019, 2021, 2023, 2025); a bill that has not finished every step by then is dead and must start over in a future session.</w:t>
       </w:r>
     </w:p>
     <w:p>
       <w:pPr>
-        <w:keepLines/>
         <w:widowControl/>
-        <w:spacing w:before="0" w:after="56" w:lineRule="auto" w:line="247"/>
-        <w:jc w:val="both"/>
+        <w:spacing w:before="0" w:after="60" w:lineRule="auto" w:line="252"/>
+        <w:ind w:left="200"/>
       </w:pPr>
+      <w:r>
+        <w:rPr>
+          <w:rFonts w:ascii="Arial" w:hAnsi="Arial" w:cs="Arial" w:eastAsia="Arial"/>
+          <w:b w:val="0"/>
+          <w:color w:val="C0392B"/>
+          <w:sz w:val="20"/>
+        </w:rPr>
+        <w:t xml:space="preserve">▪  </w:t>
+      </w:r>
       <w:r>
         <w:rPr>
           <w:rFonts w:ascii="Arial" w:hAnsi="Arial" w:cs="Arial" w:eastAsia="Arial"/>
@@ -557,7 +547,7 @@
           <w:color w:val="1A2D4F"/>
           <w:sz w:val="20"/>
         </w:rPr>
-        <w:t>Interim committee / interim study.</w:t>
+        <w:t>Special session:</w:t>
       </w:r>
       <w:r>
         <w:rPr>
@@ -566,16 +556,24 @@
           <w:color w:val="444444"/>
           <w:sz w:val="20"/>
         </w:rPr>
-        <w:t xml:space="preserve"> Panels that meet between sessions to study a topic and prepare recommendations for the next session.</w:t>
+        <w:t xml:space="preserve"> A short extra meeting the governor calls for specific topics; bills that ran out of regular-session time can pass there.</w:t>
       </w:r>
     </w:p>
     <w:p>
       <w:pPr>
-        <w:keepLines/>
         <w:widowControl/>
-        <w:spacing w:before="0" w:after="56" w:lineRule="auto" w:line="247"/>
-        <w:jc w:val="both"/>
+        <w:spacing w:before="0" w:after="60" w:lineRule="auto" w:line="252"/>
+        <w:ind w:left="200"/>
       </w:pPr>
+      <w:r>
+        <w:rPr>
+          <w:rFonts w:ascii="Arial" w:hAnsi="Arial" w:cs="Arial" w:eastAsia="Arial"/>
+          <w:b w:val="0"/>
+          <w:color w:val="C0392B"/>
+          <w:sz w:val="20"/>
+        </w:rPr>
+        <w:t xml:space="preserve">▪  </w:t>
+      </w:r>
       <w:r>
         <w:rPr>
           <w:rFonts w:ascii="Arial" w:hAnsi="Arial" w:cs="Arial" w:eastAsia="Arial"/>
@@ -583,7 +581,41 @@
           <w:color w:val="1A2D4F"/>
           <w:sz w:val="20"/>
         </w:rPr>
-        <w:t>Statute / enacted.</w:t>
+        <w:t>Sponsor:</w:t>
+      </w:r>
+      <w:r>
+        <w:rPr>
+          <w:rFonts w:ascii="Arial" w:hAnsi="Arial" w:cs="Arial" w:eastAsia="Arial"/>
+          <w:b w:val="0"/>
+          <w:color w:val="444444"/>
+          <w:sz w:val="20"/>
+        </w:rPr>
+        <w:t xml:space="preserve"> The lawmaker or committee that formally introduces a bill; a committee-sponsored bill has no single author. Cross-party sponsorship — sponsors from both parties — is one of the strongest signals a bill will pass.</w:t>
+      </w:r>
+    </w:p>
+    <w:p>
+      <w:pPr>
+        <w:widowControl/>
+        <w:spacing w:before="0" w:after="60" w:lineRule="auto" w:line="252"/>
+        <w:ind w:left="200"/>
+      </w:pPr>
+      <w:r>
+        <w:rPr>
+          <w:rFonts w:ascii="Arial" w:hAnsi="Arial" w:cs="Arial" w:eastAsia="Arial"/>
+          <w:b w:val="0"/>
+          <w:color w:val="C0392B"/>
+          <w:sz w:val="20"/>
+        </w:rPr>
+        <w:t xml:space="preserve">▪  </w:t>
+      </w:r>
+      <w:r>
+        <w:rPr>
+          <w:rFonts w:ascii="Arial" w:hAnsi="Arial" w:cs="Arial" w:eastAsia="Arial"/>
+          <w:b/>
+          <w:color w:val="1A2D4F"/>
+          <w:sz w:val="20"/>
+        </w:rPr>
+        <w:t>Statute / enacted:</w:t>
       </w:r>
       <w:r>
         <w:rPr>
@@ -597,11 +629,19 @@
     </w:p>
     <w:p>
       <w:pPr>
-        <w:keepLines/>
         <w:widowControl/>
-        <w:spacing w:before="0" w:after="56" w:lineRule="auto" w:line="247"/>
-        <w:jc w:val="both"/>
+        <w:spacing w:before="0" w:after="60" w:lineRule="auto" w:line="252"/>
+        <w:ind w:left="200"/>
       </w:pPr>
+      <w:r>
+        <w:rPr>
+          <w:rFonts w:ascii="Arial" w:hAnsi="Arial" w:cs="Arial" w:eastAsia="Arial"/>
+          <w:b w:val="0"/>
+          <w:color w:val="C0392B"/>
+          <w:sz w:val="20"/>
+        </w:rPr>
+        <w:t xml:space="preserve">▪  </w:t>
+      </w:r>
       <w:r>
         <w:rPr>
           <w:rFonts w:ascii="Arial" w:hAnsi="Arial" w:cs="Arial" w:eastAsia="Arial"/>
@@ -609,7 +649,7 @@
           <w:color w:val="1A2D4F"/>
           <w:sz w:val="20"/>
         </w:rPr>
-        <w:t>AB / SB.</w:t>
+        <w:t>Two-thirds majority:</w:t>
       </w:r>
       <w:r>
         <w:rPr>
@@ -618,16 +658,24 @@
           <w:color w:val="444444"/>
           <w:sz w:val="20"/>
         </w:rPr>
-        <w:t xml:space="preserve"> Assembly Bill / Senate Bill — the chamber a bill started in, plus its number. Numbering restarts every session, so the same number in different years is a different bill.</w:t>
+        <w:t xml:space="preserve"> The constitution requires a two-thirds vote in each chamber — 28 of 42, 14 of 21 — for any measure raising revenue, including fees; a bill can win a majority and still fail this bar.</w:t>
       </w:r>
     </w:p>
     <w:p>
       <w:pPr>
-        <w:keepLines/>
         <w:widowControl/>
-        <w:spacing w:before="0" w:after="56" w:lineRule="auto" w:line="247"/>
-        <w:jc w:val="both"/>
+        <w:spacing w:before="0" w:after="60" w:lineRule="auto" w:line="252"/>
+        <w:ind w:left="200"/>
       </w:pPr>
+      <w:r>
+        <w:rPr>
+          <w:rFonts w:ascii="Arial" w:hAnsi="Arial" w:cs="Arial" w:eastAsia="Arial"/>
+          <w:b w:val="0"/>
+          <w:color w:val="C0392B"/>
+          <w:sz w:val="20"/>
+        </w:rPr>
+        <w:t xml:space="preserve">▪  </w:t>
+      </w:r>
       <w:r>
         <w:rPr>
           <w:rFonts w:ascii="Arial" w:hAnsi="Arial" w:cs="Arial" w:eastAsia="Arial"/>
@@ -635,7 +683,7 @@
           <w:color w:val="1A2D4F"/>
           <w:sz w:val="20"/>
         </w:rPr>
-        <w:t>D / R.</w:t>
+        <w:t>Veto:</w:t>
       </w:r>
       <w:r>
         <w:rPr>
@@ -644,8 +692,53 @@
           <w:color w:val="444444"/>
           <w:sz w:val="20"/>
         </w:rPr>
-        <w:t xml:space="preserve"> Democrat / Republican, shown after a legislator's name; "still serves" and "has left" reflect the current roster.</w:t>
+        <w:t xml:space="preserve"> The governor's rejection of a bill that passed both chambers. A vetoed bill does not become law unless two-thirds of each chamber votes to override the veto.</w:t>
       </w:r>
+    </w:p>
+    <w:p>
+      <w:pPr>
+        <w:widowControl/>
+        <w:spacing w:before="0" w:after="60" w:lineRule="auto" w:line="252"/>
+        <w:ind w:left="200"/>
+      </w:pPr>
+      <w:r>
+        <w:rPr>
+          <w:rFonts w:ascii="Arial" w:hAnsi="Arial" w:cs="Arial" w:eastAsia="Arial"/>
+          <w:b w:val="0"/>
+          <w:color w:val="C0392B"/>
+          <w:sz w:val="20"/>
+        </w:rPr>
+        <w:t xml:space="preserve">▪  </w:t>
+      </w:r>
+      <w:r>
+        <w:rPr>
+          <w:rFonts w:ascii="Arial" w:hAnsi="Arial" w:cs="Arial" w:eastAsia="Arial"/>
+          <w:b/>
+          <w:color w:val="1A2D4F"/>
+          <w:sz w:val="20"/>
+        </w:rPr>
+        <w:t>Vote pairs such as "42–0 and 21–0":</w:t>
+      </w:r>
+      <w:r>
+        <w:rPr>
+          <w:rFonts w:ascii="Arial" w:hAnsi="Arial" w:cs="Arial" w:eastAsia="Arial"/>
+          <w:b w:val="0"/>
+          <w:color w:val="444444"/>
+          <w:sz w:val="20"/>
+        </w:rPr>
+        <w:t xml:space="preserve"> Floor votes are yes–no tallies, one per chamber; 42–0 is a unanimous Assembly vote, 21–0 a unanimous Senate vote.</w:t>
+      </w:r>
+    </w:p>
+    <w:p>
+      <w:pPr>
+        <w:sectPr>
+          <w:type w:val="continuous"/>
+          <w:pgSz w:w="12240" w:h="15840"/>
+          <w:pgMar w:top="864" w:right="864" w:bottom="864" w:left="864" w:header="720" w:footer="720" w:gutter="0"/>
+          <w:cols w:space="300" w:num="2"/>
+          <w:docGrid w:linePitch="360"/>
+        </w:sectPr>
+      </w:pPr>
     </w:p>
     <w:p>
       <w:pPr>
@@ -667,9 +760,10 @@
       </w:r>
     </w:p>
     <w:sectPr>
+      <w:type w:val="continuous"/>
       <w:pgSz w:w="12240" w:h="15840"/>
       <w:pgMar w:top="864" w:right="864" w:bottom="864" w:left="864" w:header="720" w:footer="720" w:gutter="0"/>
-      <w:cols w:space="720"/>
+      <w:cols w:space="300" w:num="1"/>
       <w:docGrid w:linePitch="360"/>
     </w:sectPr>
   </w:body>

</xml_diff>